<commit_message>
Harden smoke simulation CI assertions
</commit_message>
<xml_diff>
--- a/PROJECT_HANDOFF_2026-03-27.docx
+++ b/PROJECT_HANDOFF_2026-03-27.docx
@@ -26,7 +26,7 @@
     </w:p>
     <w:p>
       <w:r>
-        <w:t xml:space="preserve">Last refreshed: March 27, 2026 after the GitHub repo hookup, the proprietary-license decision pass, the launch-default recommendation pass, the honest-settings cleanup, the support/privacy draft-page addition, the GitHub Actions validation workflow addition, the Android-only copy alignment pass, a native app-label cleanup, a fresh automated validation rerun, and a live Android emulator smoke pass.</w:t>
+        <w:t xml:space="preserve">Last refreshed: March 27, 2026 after the GitHub repo hookup, the proprietary-license decision pass, the launch-default recommendation pass, the honest-settings cleanup, the support/privacy draft-page addition, the GitHub Actions validation workflow addition, the Android-only copy alignment pass, a native app-label cleanup, a smoke-sim CI-hardening pass, a fresh automated validation rerun, and a live Android emulator smoke pass.</w:t>
       </w:r>
     </w:p>
     <w:p/>
@@ -97,6 +97,16 @@
     </w:p>
     <w:p>
       <w:r>
+        <w:t xml:space="preserve">- `scripts/smoke-sim.cjs` was hardened after a GitHub Actions failure so authored combat assertions compare logged damage / healing / retaliation effects instead of brittle clamped end-state HP.</w:t>
+      </w:r>
+    </w:p>
+    <w:p>
+      <w:r>
+        <w:t xml:space="preserve">- Retaliation-sensitive smoke cases now use a durable temporary enemy HP pool inside the test harness so overkill does not accidentally skip the retaliation checks the test is trying to verify.</w:t>
+      </w:r>
+    </w:p>
+    <w:p>
+      <w:r>
         <w:t xml:space="preserve">- New draft support/privacy routes and matching markdown docs now exist:</w:t>
       </w:r>
     </w:p>
@@ -191,6 +201,11 @@
         <w:t xml:space="preserve">- `npm run smoke:sim`: passed</w:t>
       </w:r>
     </w:p>
+    <w:p>
+      <w:r>
+        <w:t xml:space="preserve">- `npm run smoke:sim` repeated local reruns after the CI-hardening patch: 8 consecutive passes</w:t>
+      </w:r>
+    </w:p>
     <w:p/>
     <w:p>
       <w:r>
@@ -292,7 +307,7 @@
     </w:p>
     <w:p>
       <w:r>
-        <w:t xml:space="preserve">  - `run-1774625461198-klyri1c7`</w:t>
+        <w:t xml:space="preserve">  - `run-1774631026035-gbh0qzyl`</w:t>
       </w:r>
     </w:p>
     <w:p>
@@ -322,7 +337,7 @@
     </w:p>
     <w:p>
       <w:r>
-        <w:t xml:space="preserve">  - `71`</w:t>
+        <w:t xml:space="preserve">  - `82`</w:t>
       </w:r>
     </w:p>
     <w:p>
@@ -450,6 +465,11 @@
     </w:p>
     <w:p>
       <w:r>
+        <w:t xml:space="preserve">- The smoke simulation is now a more trustworthy CI gate because its authored combat assertions no longer depend on clamped HP comparisons that can flatten on overkill.</w:t>
+      </w:r>
+    </w:p>
+    <w:p>
+      <w:r>
         <w:t xml:space="preserve">- Draft support/privacy content now exists inside the repo and app shell, even though the final public support email and public hosting URL still need owner confirmation.</w:t>
       </w:r>
     </w:p>
@@ -523,7 +543,7 @@
     <w:p/>
     <w:p>
       <w:r>
-        <w:t xml:space="preserve">The repo is now GitHub-ready, the docs are better aligned with the actual current release situation, the public repository now has an explicit proprietary license notice, the live settings screen no longer exposes fake controls, draft support/privacy pages now exist, the Android display name now matches the real game title instead of the repo slug, the core automated gates still pass as of March 27, 2026, and the live Android dev-build smoke path has now been manually re-confirmed through resume, event choice, floor transition, battle, reward claim, and map return. No reproducible gameplay defect was uncovered during this pass. The project still remains in release-candidate hardening mode rather than feature-development mode. The most important remaining work is now one full Android release-build manual validation run, resolving or working around the Windows long-path rebuild blocker if a fresh signed artifact is needed from this machine, locking the final public support inbox, turning on branch protection that requires CI, and finishing store-prep work under the existing no-new-scope rule.</w:t>
+        <w:t xml:space="preserve">The repo is now GitHub-ready, the docs are better aligned with the actual current release situation, the public repository now has an explicit proprietary license notice, the live settings screen no longer exposes fake controls, draft support/privacy pages now exist, the Android display name now matches the real game title instead of the repo slug, the smoke simulation has been hardened against the GitHub Actions flake caused by clamped HP comparisons, the core automated gates still pass as of March 27, 2026, and the live Android dev-build smoke path has now been manually re-confirmed through resume, event choice, floor transition, battle, reward claim, and map return. No reproducible gameplay defect was uncovered during this pass. The project still remains in release-candidate hardening mode rather than feature-development mode. The most important remaining work is now one full Android release-build manual validation run, resolving or working around the Windows long-path rebuild blocker if a fresh signed artifact is needed from this machine, locking the final public support inbox, turning on branch protection that requires CI, and finishing store-prep work under the existing no-new-scope rule.</w:t>
       </w:r>
     </w:p>
     <w:p/>

</xml_diff>